<commit_message>
Update Elastic IPs in architecture document
</commit_message>
<xml_diff>
--- a/docs/Architecture-Document.docx
+++ b/docs/Architecture-Document.docx
@@ -1922,7 +1922,7 @@
                 <w:sz w:val="20"/>
                 <w:szCs w:val="20"/>
               </w:rPr>
-              <w:t xml:space="preserve">13.210.247.62</w:t>
+              <w:t xml:space="preserve">54.252.6.48</w:t>
             </w:r>
           </w:p>
         </w:tc>
@@ -2080,7 +2080,7 @@
                 <w:sz w:val="20"/>
                 <w:szCs w:val="20"/>
               </w:rPr>
-              <w:t xml:space="preserve">16.176.220.31</w:t>
+              <w:t xml:space="preserve">3.106.152.10</w:t>
             </w:r>
           </w:p>
         </w:tc>
@@ -2238,7 +2238,7 @@
                 <w:sz w:val="20"/>
                 <w:szCs w:val="20"/>
               </w:rPr>
-              <w:t xml:space="preserve">3.25.111.45</w:t>
+              <w:t xml:space="preserve">3.104.203.56</w:t>
             </w:r>
           </w:p>
         </w:tc>
@@ -2396,7 +2396,7 @@
                 <w:sz w:val="20"/>
                 <w:szCs w:val="20"/>
               </w:rPr>
-              <w:t xml:space="preserve">13.211.167.57</w:t>
+              <w:t xml:space="preserve">13.55.121.11</w:t>
             </w:r>
           </w:p>
         </w:tc>
@@ -2554,7 +2554,7 @@
                 <w:sz w:val="20"/>
                 <w:szCs w:val="20"/>
               </w:rPr>
-              <w:t xml:space="preserve">3.27.228.83</w:t>
+              <w:t xml:space="preserve">52.64.128.1</w:t>
             </w:r>
           </w:p>
         </w:tc>
@@ -3170,7 +3170,7 @@
                 <w:sz w:val="20"/>
                 <w:szCs w:val="20"/>
               </w:rPr>
-              <w:t xml:space="preserve">Orchestrates 7-stage CI/CD pipeline at 13.210.247.62:8080. GitHub webhook.</w:t>
+              <w:t xml:space="preserve">Orchestrates 7-stage CI/CD pipeline at 54.252.6.48:8080. GitHub webhook.</w:t>
             </w:r>
           </w:p>
         </w:tc>
@@ -3250,7 +3250,7 @@
                 <w:sz w:val="20"/>
                 <w:szCs w:val="20"/>
               </w:rPr>
-              <w:t xml:space="preserve">Static analysis at 16.176.220.31:9000. Quality gate on every build.</w:t>
+              <w:t xml:space="preserve">Static analysis at 3.106.152.10:9000. Quality gate on every build.</w:t>
             </w:r>
           </w:p>
         </w:tc>
@@ -3330,7 +3330,7 @@
                 <w:sz w:val="20"/>
                 <w:szCs w:val="20"/>
               </w:rPr>
-              <w:t xml:space="preserve">Docker image registry at 16.176.220.31:8082. banking-docker repository.</w:t>
+              <w:t xml:space="preserve">Docker image registry at 3.106.152.10:8082. banking-docker repository.</w:t>
             </w:r>
           </w:p>
         </w:tc>
@@ -3490,7 +3490,7 @@
                 <w:sz w:val="20"/>
                 <w:szCs w:val="20"/>
               </w:rPr>
-              <w:t xml:space="preserve">Splunk at 3.27.228.83:8000. CloudWatch log group /banking-app/docker + 3 alarms.</w:t>
+              <w:t xml:space="preserve">Splunk at 52.64.128.1:8000. CloudWatch log group /banking-app/docker + 3 alarms.</w:t>
             </w:r>
           </w:p>
         </w:tc>
@@ -5493,7 +5493,7 @@
           <w:sz w:val="22"/>
           <w:szCs w:val="22"/>
         </w:rPr>
-        <w:t xml:space="preserve">Jenkins URL: http://13.210.247.62:8080 | Job: banking-app-pipeline | Build #6 SUCCESS | Auto-triggered via GitHub webhook</w:t>
+        <w:t xml:space="preserve">Jenkins URL: http://54.252.6.48:8080 | Job: banking-app-pipeline | Build #6 SUCCESS | Auto-triggered via GitHub webhook</w:t>
       </w:r>
     </w:p>
     <w:p>
@@ -7704,7 +7704,7 @@
           <w:sz w:val="22"/>
           <w:szCs w:val="22"/>
         </w:rPr>
-        <w:t xml:space="preserve">Nexus Repository Manager 3.77.0 — http://16.176.220.31:8081</w:t>
+        <w:t xml:space="preserve">Nexus Repository Manager 3.77.0 — http://3.106.152.10:8081</w:t>
       </w:r>
     </w:p>
     <w:p>
@@ -11037,7 +11037,7 @@
                 <w:sz w:val="20"/>
                 <w:szCs w:val="20"/>
               </w:rPr>
-              <w:t xml:space="preserve">http://3.27.228.83:8000 — Instance 5 (t3.medium)</w:t>
+              <w:t xml:space="preserve">http://52.64.128.1:8000 — Instance 5 (t3.medium)</w:t>
             </w:r>
           </w:p>
         </w:tc>
@@ -13288,7 +13288,7 @@
           <w:sz w:val="18"/>
           <w:szCs w:val="18"/>
         </w:rPr>
-        <w:t xml:space="preserve">echo '{"insecure-registries":["16.176.220.31:8082"]}' | sudo tee /etc/docker/daemon.json</w:t>
+        <w:t xml:space="preserve">echo '{"insecure-registries":["3.106.152.10:8082"]}' | sudo tee /etc/docker/daemon.json</w:t>
       </w:r>
     </w:p>
     <w:p>
@@ -13320,7 +13320,7 @@
           <w:sz w:val="18"/>
           <w:szCs w:val="18"/>
         </w:rPr>
-        <w:t xml:space="preserve">sudo docker login 16.176.220.31:8082 -u admin -p Admin@123</w:t>
+        <w:t xml:space="preserve">sudo docker login 3.106.152.10:8082 -u admin -p Admin@123</w:t>
       </w:r>
     </w:p>
     <w:p>
@@ -13353,7 +13353,7 @@
           <w:sz w:val="22"/>
           <w:szCs w:val="22"/>
         </w:rPr>
-        <w:t xml:space="preserve">Browse to http://13.210.247.62:8080</w:t>
+        <w:t xml:space="preserve">Browse to http://54.252.6.48:8080</w:t>
       </w:r>
     </w:p>
     <w:p>
@@ -13404,7 +13404,7 @@
           <w:sz w:val="22"/>
           <w:szCs w:val="22"/>
         </w:rPr>
-        <w:t xml:space="preserve">Configure SonarQube server at http://16.176.220.31:9000</w:t>
+        <w:t xml:space="preserve">Configure SonarQube server at http://3.106.152.10:9000</w:t>
       </w:r>
     </w:p>
     <w:p>
@@ -13455,7 +13455,7 @@
           <w:sz w:val="22"/>
           <w:szCs w:val="22"/>
         </w:rPr>
-        <w:t xml:space="preserve">Add GitHub webhook: Payload URL: http://13.210.247.62:8080/github-webhook/</w:t>
+        <w:t xml:space="preserve">Add GitHub webhook: Payload URL: http://54.252.6.48:8080/github-webhook/</w:t>
       </w:r>
     </w:p>
     <w:p>
@@ -13488,7 +13488,7 @@
           <w:sz w:val="22"/>
           <w:szCs w:val="22"/>
         </w:rPr>
-        <w:t xml:space="preserve">Login at http://16.176.220.31:8081 (admin/Admin@123)</w:t>
+        <w:t xml:space="preserve">Login at http://3.106.152.10:8081 (admin/Admin@123)</w:t>
       </w:r>
     </w:p>
     <w:p>
@@ -13588,7 +13588,7 @@
           <w:sz w:val="18"/>
           <w:szCs w:val="18"/>
         </w:rPr>
-        <w:t xml:space="preserve">scp -i devops-lab-key.pem devops-lab-key.pem ec2-user@13.211.167.57:~/</w:t>
+        <w:t xml:space="preserve">scp -i devops-lab-key.pem devops-lab-key.pem ec2-user@13.55.121.11:~/</w:t>
       </w:r>
     </w:p>
     <w:p>
@@ -13604,7 +13604,7 @@
           <w:sz w:val="18"/>
           <w:szCs w:val="18"/>
         </w:rPr>
-        <w:t xml:space="preserve">ssh -i devops-lab-key.pem ec2-user@13.211.167.57</w:t>
+        <w:t xml:space="preserve">ssh -i devops-lab-key.pem ec2-user@13.55.121.11</w:t>
       </w:r>
     </w:p>
     <w:p>
@@ -13708,7 +13708,7 @@
           <w:sz w:val="22"/>
           <w:szCs w:val="22"/>
         </w:rPr>
-        <w:t xml:space="preserve">Monitor at: http://13.210.247.62:8080 | App live at: http://banking-alb-1942364575.ap-southeast-2.elb.amazonaws.com</w:t>
+        <w:t xml:space="preserve">Monitor at: http://54.252.6.48:8080 | App live at: http://banking-alb-1942364575.ap-southeast-2.elb.amazonaws.com</w:t>
       </w:r>
     </w:p>
     <w:p>
@@ -13775,7 +13775,7 @@
           <w:sz w:val="22"/>
           <w:szCs w:val="22"/>
         </w:rPr>
-        <w:t xml:space="preserve">Verify Splunk: http://3.27.228.83:8000 → Search: index=main sourcetype=docker_logs</w:t>
+        <w:t xml:space="preserve">Verify Splunk: http://52.64.128.1:8000 → Search: index=main sourcetype=docker_logs</w:t>
       </w:r>
     </w:p>
     <w:p>
@@ -15564,7 +15564,7 @@
                 <w:sz w:val="20"/>
                 <w:szCs w:val="20"/>
               </w:rPr>
-              <w:t xml:space="preserve">http://13.210.247.62:8080</w:t>
+              <w:t xml:space="preserve">http://54.252.6.48:8080</w:t>
             </w:r>
           </w:p>
         </w:tc>
@@ -15644,7 +15644,7 @@
                 <w:sz w:val="20"/>
                 <w:szCs w:val="20"/>
               </w:rPr>
-              <w:t xml:space="preserve">http://16.176.220.31:9000</w:t>
+              <w:t xml:space="preserve">http://3.106.152.10:9000</w:t>
             </w:r>
           </w:p>
         </w:tc>
@@ -15724,7 +15724,7 @@
                 <w:sz w:val="20"/>
                 <w:szCs w:val="20"/>
               </w:rPr>
-              <w:t xml:space="preserve">http://16.176.220.31:8081</w:t>
+              <w:t xml:space="preserve">http://3.106.152.10:8081</w:t>
             </w:r>
           </w:p>
         </w:tc>
@@ -15804,7 +15804,7 @@
                 <w:sz w:val="20"/>
                 <w:szCs w:val="20"/>
               </w:rPr>
-              <w:t xml:space="preserve">16.176.220.31:8082</w:t>
+              <w:t xml:space="preserve">3.106.152.10:8082</w:t>
             </w:r>
           </w:p>
         </w:tc>
@@ -15884,7 +15884,7 @@
                 <w:sz w:val="20"/>
                 <w:szCs w:val="20"/>
               </w:rPr>
-              <w:t xml:space="preserve">http://3.27.228.83:8000</w:t>
+              <w:t xml:space="preserve">http://52.64.128.1:8000</w:t>
             </w:r>
           </w:p>
         </w:tc>
@@ -16208,7 +16208,7 @@
                 <w:sz w:val="20"/>
                 <w:szCs w:val="20"/>
               </w:rPr>
-              <w:t xml:space="preserve">ssh -i devops-lab-key.pem ec2-user@13.210.247.62</w:t>
+              <w:t xml:space="preserve">ssh -i devops-lab-key.pem ec2-user@54.252.6.48</w:t>
             </w:r>
           </w:p>
         </w:tc>
@@ -16288,7 +16288,7 @@
                 <w:sz w:val="20"/>
                 <w:szCs w:val="20"/>
               </w:rPr>
-              <w:t xml:space="preserve">ssh -i devops-lab-key.pem ec2-user@16.176.220.31</w:t>
+              <w:t xml:space="preserve">ssh -i devops-lab-key.pem ec2-user@3.106.152.10</w:t>
             </w:r>
           </w:p>
         </w:tc>
@@ -16368,7 +16368,7 @@
                 <w:sz w:val="20"/>
                 <w:szCs w:val="20"/>
               </w:rPr>
-              <w:t xml:space="preserve">ssh -i devops-lab-key.pem ec2-user@3.25.111.45</w:t>
+              <w:t xml:space="preserve">ssh -i devops-lab-key.pem ec2-user@3.104.203.56</w:t>
             </w:r>
           </w:p>
         </w:tc>
@@ -16448,7 +16448,7 @@
                 <w:sz w:val="20"/>
                 <w:szCs w:val="20"/>
               </w:rPr>
-              <w:t xml:space="preserve">ssh -i devops-lab-key.pem ec2-user@13.211.167.57</w:t>
+              <w:t xml:space="preserve">ssh -i devops-lab-key.pem ec2-user@13.55.121.11</w:t>
             </w:r>
           </w:p>
         </w:tc>
@@ -16528,7 +16528,7 @@
                 <w:sz w:val="20"/>
                 <w:szCs w:val="20"/>
               </w:rPr>
-              <w:t xml:space="preserve">ssh -i devops-lab-key.pem ec2-user@3.27.228.83</w:t>
+              <w:t xml:space="preserve">ssh -i devops-lab-key.pem ec2-user@52.64.128.1</w:t>
             </w:r>
           </w:p>
         </w:tc>

</xml_diff>